<commit_message>
Update authors to Majji Naveen, Parri Hari Chandan, M. Siva Charan Reddy under supervision of Jayalakshmi M across Springer and IEEE manuscripts
</commit_message>
<xml_diff>
--- a/paper/NeuroClean_IEEE_Access_Journal.docx
+++ b/paper/NeuroClean_IEEE_Access_Journal.docx
@@ -41,7 +41,7 @@
           <w:b/>
           <w:sz w:val="21"/>
         </w:rPr>
-        <w:t>NAVEEN MAJJI</w:t>
+        <w:t>MAJJI NAVEEN</w:t>
       </w:r>
       <w:r>
         <w:rPr>
@@ -59,14 +59,32 @@
           <w:b/>
           <w:sz w:val="21"/>
         </w:rPr>
-        <w:t>RESEARCH COLLABORATOR</w:t>
+        <w:t>PARRI HARI CHANDAN</w:t>
       </w:r>
       <w:r>
         <w:rPr>
           <w:b/>
           <w:vertAlign w:val="superscript"/>
         </w:rPr>
-        <w:t>2</w:t>
+        <w:t>1</w:t>
+      </w:r>
+      <w:r>
+        <w:t xml:space="preserve">, </w:t>
+      </w:r>
+      <w:r>
+        <w:rPr>
+          <w:rFonts w:ascii="Arial" w:hAnsi="Arial"/>
+          <w:b/>
+          <w:sz w:val="21"/>
+        </w:rPr>
+        <w:t>M. SIVA CHARAN REDDY</w:t>
+      </w:r>
+      <w:r>
+        <w:rPr>
+          <w:b/>
+          <w:vertAlign w:val="superscript"/>
+        </w:rPr>
+        <w:t>1</w:t>
       </w:r>
       <w:r>
         <w:t xml:space="preserve">, AND </w:t>
@@ -77,14 +95,14 @@
           <w:b/>
           <w:sz w:val="21"/>
         </w:rPr>
-        <w:t>FACULTY ADVISOR</w:t>
+        <w:t>JAYALAKSHMI M</w:t>
       </w:r>
       <w:r>
         <w:rPr>
           <w:b/>
           <w:vertAlign w:val="superscript"/>
         </w:rPr>
-        <w:t>3*</w:t>
+        <w:t>1*</w:t>
       </w:r>
     </w:p>
     <w:p>
@@ -97,13 +115,11 @@
           <w:color w:val="505050"/>
           <w:sz w:val="17"/>
         </w:rPr>
-        <w:t>1 Department of Computer Science and Engineering, Vellore Institute of Technology, Vellore, Tamil Nadu 632014, India</w:t>
+        <w:t>1 School of Computer Science and Engineering (SCOPE), Vellore Institute of Technology (VIT), Vellore, Tamil Nadu 632014, India</w:t>
         <w:br/>
-        <w:t>2 Department of Computer Science and Engineering, Vellore Institute of Technology, Vellore, Tamil Nadu 632014, India</w:t>
+        <w:t>Emails: majji.naveen2023@gmail.com, harichandan.parri2023@vitstudent.ac.in, mareddy.siva2023@vitstudent.ac.in, m.jayalakshmi@vit.ac.in</w:t>
         <w:br/>
-        <w:t>3 School of Computer Science and Engineering (SCOPE), Vellore Institute of Technology, Vellore, Tamil Nadu 632014, India</w:t>
-        <w:br/>
-        <w:t>*Corresponding author: Naveen Majji (e-mail: naveen.majji@vit.ac.in).</w:t>
+        <w:t>*Under the Supervision of &amp; Corresponding Author: Dr. Jayalakshmi M (Associate Professor, SCOPE, VIT Vellore, Email: m.jayalakshmi@vit.ac.in).</w:t>
       </w:r>
     </w:p>
     <w:tbl>
@@ -2608,7 +2624,7 @@
           <w:rFonts w:ascii="Times New Roman" w:hAnsi="Times New Roman"/>
           <w:sz w:val="20"/>
         </w:rPr>
-        <w:t>NAVEEN MAJJI is currently pursuing a Bachelor of Technology degree in Computer Science and Engineering at Vellore Institute of Technology (VIT), Vellore, India. His research interests encompass deep learning, computational photography, computer vision, and high-performance machine learning system deployment. Through his work on the NeuroClean project, he has pioneered hybrid neural architectures combining multi-scale contextual representations with deep residual noise estimation, alongside engineered windowed inference algorithms for high-resolution computational imaging.</w:t>
+        <w:t>MAJJI NAVEEN is currently pursuing a Bachelor of Technology degree in Computer Science and Engineering at Vellore Institute of Technology (VIT), Vellore, India (Email: majji.naveen2023@gmail.com). His research interests encompass deep learning, computational photography, computer vision, and high-performance machine learning system deployment. Through his work on the NeuroClean project, he has pioneered hybrid neural architectures combining multi-scale contextual representations with deep residual noise estimation, alongside engineered windowed inference algorithms for high-resolution computational imaging.</w:t>
       </w:r>
     </w:p>
     <w:p>
@@ -2621,7 +2637,7 @@
           <w:rFonts w:ascii="Times New Roman" w:hAnsi="Times New Roman"/>
           <w:sz w:val="20"/>
         </w:rPr>
-        <w:t>RESEARCH COLLABORATOR is currently pursuing a B.Tech. degree in Computer Science and Engineering at Vellore Institute of Technology, Vellore, India. Research interests include digital signal processing, convolutional neural networks, and web-based artificial intelligence deployment frameworks.</w:t>
+        <w:t>PARRI HARI CHANDAN is currently pursuing a B.Tech. degree in Computer Science and Engineering at Vellore Institute of Technology (VIT), Vellore, India (Email: harichandan.parri2023@vitstudent.ac.in). Research interests include digital signal processing, convolutional neural networks, and web-based artificial intelligence deployment frameworks.</w:t>
       </w:r>
     </w:p>
     <w:p>
@@ -2634,7 +2650,20 @@
           <w:rFonts w:ascii="Times New Roman" w:hAnsi="Times New Roman"/>
           <w:sz w:val="20"/>
         </w:rPr>
-        <w:t>FACULTY ADVISOR is a Senior Assistant Professor at the School of Computer Science and Engineering (SCOPE), Vellore Institute of Technology, Vellore, India. With extensive academic and industrial research experience in artificial intelligence, digital image processing, and secure distributed computing, they have guided numerous capstone research initiatives and published extensively in indexed international journals and conferences.</w:t>
+        <w:t>M. SIVA CHARAN REDDY is currently pursuing a B.Tech. degree in Computer Science and Engineering at Vellore Institute of Technology (VIT), Vellore, India (Email: mareddy.siva2023@vitstudent.ac.in). Research interests include computer vision, neural image enhancement, and cloud-based machine learning systems.</w:t>
+      </w:r>
+    </w:p>
+    <w:p>
+      <w:pPr>
+        <w:spacing w:after="80" w:line="276" w:lineRule="auto"/>
+        <w:jc w:val="both"/>
+      </w:pPr>
+      <w:r>
+        <w:rPr>
+          <w:rFonts w:ascii="Times New Roman" w:hAnsi="Times New Roman"/>
+          <w:sz w:val="20"/>
+        </w:rPr>
+        <w:t>JAYALAKSHMI M is an Associate Professor at the School of Computer Science and Engineering (SCOPE), Vellore Institute of Technology (VIT), Vellore, India (Email: m.jayalakshmi@vit.ac.in). With extensive academic and research experience in artificial intelligence, computer vision, digital image processing, and distributed machine learning systems, she has supervised numerous research initiatives and published extensively in indexed international journals and conferences.</w:t>
       </w:r>
     </w:p>
     <w:sectPr>

</xml_diff>

<commit_message>
Integrate 15 verified academic reference weblinks into PPT presentation, Springer and IEEE manuscripts
</commit_message>
<xml_diff>
--- a/paper/NeuroClean_IEEE_Access_Journal.docx
+++ b/paper/NeuroClean_IEEE_Access_Journal.docx
@@ -2611,6 +2611,747 @@
           <w:color w:val="00629B"/>
           <w:sz w:val="23"/>
         </w:rPr>
+        <w:t>REFERENCES</w:t>
+      </w:r>
+    </w:p>
+    <w:p>
+      <w:pPr>
+        <w:spacing w:after="60" w:line="264" w:lineRule="auto"/>
+        <w:jc w:val="both"/>
+      </w:pPr>
+      <w:r>
+        <w:rPr>
+          <w:rFonts w:ascii="Times New Roman" w:hAnsi="Times New Roman"/>
+          <w:b/>
+          <w:color w:val="00629B"/>
+          <w:sz w:val="19"/>
+        </w:rPr>
+        <w:t xml:space="preserve">[1] </w:t>
+      </w:r>
+      <w:r>
+        <w:rPr>
+          <w:rFonts w:ascii="Times New Roman" w:hAnsi="Times New Roman"/>
+          <w:sz w:val="19"/>
+        </w:rPr>
+        <w:t xml:space="preserve">A. Dudhane, S. W. Zamir, S. Khan, and F. S. Khan, "Burst image restoration and enhancement," in Proc. IEEE/CVF Conf. Comput. Vis. Pattern Recognit. (CVPR), 2022. </w:t>
+      </w:r>
+      <w:hyperlink r:id="rId11">
+        <w:r>
+          <w:t>https://arxiv.org/abs/2110.03680</w:t>
+          <w:rPr>
+            <w:rFonts w:ascii="Times New Roman" w:hAnsi="Times New Roman"/>
+            <w:sz w:val="19"/>
+            <w:color w:val="0066CC"/>
+            <w:u w:val="single"/>
+          </w:rPr>
+        </w:r>
+      </w:hyperlink>
+    </w:p>
+    <w:p>
+      <w:pPr>
+        <w:spacing w:after="60" w:line="264" w:lineRule="auto"/>
+        <w:jc w:val="both"/>
+      </w:pPr>
+      <w:r>
+        <w:rPr>
+          <w:rFonts w:ascii="Times New Roman" w:hAnsi="Times New Roman"/>
+          <w:b/>
+          <w:color w:val="00629B"/>
+          <w:sz w:val="19"/>
+        </w:rPr>
+        <w:t xml:space="preserve">[2] </w:t>
+      </w:r>
+      <w:r>
+        <w:rPr>
+          <w:rFonts w:ascii="Times New Roman" w:hAnsi="Times New Roman"/>
+          <w:sz w:val="19"/>
+        </w:rPr>
+        <w:t xml:space="preserve">R. Flepp, A. Ignatov, R. Timofte, and L. Van Gool, "Real-world mobile image denoising dataset with efficient baselines," in Proc. IEEE/CVF Conf. Comput. Vis. Pattern Recognit. (CVPR), pp. 2596–2606, 2024. </w:t>
+      </w:r>
+      <w:hyperlink r:id="rId12">
+        <w:r>
+          <w:t>https://paperswithcode.com/paper/real-world-mobile-image-denoising-dataset</w:t>
+          <w:rPr>
+            <w:rFonts w:ascii="Times New Roman" w:hAnsi="Times New Roman"/>
+            <w:sz w:val="19"/>
+            <w:color w:val="0066CC"/>
+            <w:u w:val="single"/>
+          </w:rPr>
+        </w:r>
+      </w:hyperlink>
+    </w:p>
+    <w:p>
+      <w:pPr>
+        <w:spacing w:after="60" w:line="264" w:lineRule="auto"/>
+        <w:jc w:val="both"/>
+      </w:pPr>
+      <w:r>
+        <w:rPr>
+          <w:rFonts w:ascii="Times New Roman" w:hAnsi="Times New Roman"/>
+          <w:b/>
+          <w:color w:val="00629B"/>
+          <w:sz w:val="19"/>
+        </w:rPr>
+        <w:t xml:space="preserve">[3] </w:t>
+      </w:r>
+      <w:r>
+        <w:rPr>
+          <w:rFonts w:ascii="Times New Roman" w:hAnsi="Times New Roman"/>
+          <w:sz w:val="19"/>
+        </w:rPr>
+        <w:t xml:space="preserve">S. Guo, "Toward effective image restoration from raw domain," Ph.D. Dissertation, Dept. Comput., Hong Kong Polytech. Univ., Hong Kong, 2024. </w:t>
+      </w:r>
+      <w:hyperlink r:id="rId13">
+        <w:r>
+          <w:t>https://theses.lib.polyu.edu.hk/handle/200/12922</w:t>
+          <w:rPr>
+            <w:rFonts w:ascii="Times New Roman" w:hAnsi="Times New Roman"/>
+            <w:sz w:val="19"/>
+            <w:color w:val="0066CC"/>
+            <w:u w:val="single"/>
+          </w:rPr>
+        </w:r>
+      </w:hyperlink>
+    </w:p>
+    <w:p>
+      <w:pPr>
+        <w:spacing w:after="60" w:line="264" w:lineRule="auto"/>
+        <w:jc w:val="both"/>
+      </w:pPr>
+      <w:r>
+        <w:rPr>
+          <w:rFonts w:ascii="Times New Roman" w:hAnsi="Times New Roman"/>
+          <w:b/>
+          <w:color w:val="00629B"/>
+          <w:sz w:val="19"/>
+        </w:rPr>
+        <w:t xml:space="preserve">[4] </w:t>
+      </w:r>
+      <w:r>
+        <w:rPr>
+          <w:rFonts w:ascii="Times New Roman" w:hAnsi="Times New Roman"/>
+          <w:sz w:val="19"/>
+        </w:rPr>
+        <w:t xml:space="preserve">Z. Li, H. Liu, L. Cheng, and X. Jia, "Image denoising algorithm based on gradient domain guided filtering and NSST," IEEE Access, vol. 11, pp. 11923–11933, 2023. </w:t>
+      </w:r>
+      <w:hyperlink r:id="rId14">
+        <w:r>
+          <w:t>https://ieeexplore.ieee.org/document/10035968</w:t>
+          <w:rPr>
+            <w:rFonts w:ascii="Times New Roman" w:hAnsi="Times New Roman"/>
+            <w:sz w:val="19"/>
+            <w:color w:val="0066CC"/>
+            <w:u w:val="single"/>
+          </w:rPr>
+        </w:r>
+      </w:hyperlink>
+    </w:p>
+    <w:p>
+      <w:pPr>
+        <w:spacing w:after="60" w:line="264" w:lineRule="auto"/>
+        <w:jc w:val="both"/>
+      </w:pPr>
+      <w:r>
+        <w:rPr>
+          <w:rFonts w:ascii="Times New Roman" w:hAnsi="Times New Roman"/>
+          <w:b/>
+          <w:color w:val="00629B"/>
+          <w:sz w:val="19"/>
+        </w:rPr>
+        <w:t xml:space="preserve">[5] </w:t>
+      </w:r>
+      <w:r>
+        <w:rPr>
+          <w:rFonts w:ascii="Times New Roman" w:hAnsi="Times New Roman"/>
+          <w:sz w:val="19"/>
+        </w:rPr>
+        <w:t xml:space="preserve">L. Kumari, N. Mittal, and M. Modi, "Comparative analysis of noise reduction filters for medical images," in Proc. Signal Image Process. Appl., ResearchGate, 2024. </w:t>
+      </w:r>
+      <w:hyperlink r:id="rId15">
+        <w:r>
+          <w:t>https://www.researchgate.net/publication/379162688_Comparative_Analysis_of_Noise_Reduction_Filters_for_Medical_Images</w:t>
+          <w:rPr>
+            <w:rFonts w:ascii="Times New Roman" w:hAnsi="Times New Roman"/>
+            <w:sz w:val="19"/>
+            <w:color w:val="0066CC"/>
+            <w:u w:val="single"/>
+          </w:rPr>
+        </w:r>
+      </w:hyperlink>
+    </w:p>
+    <w:p>
+      <w:pPr>
+        <w:spacing w:after="60" w:line="264" w:lineRule="auto"/>
+        <w:jc w:val="both"/>
+      </w:pPr>
+      <w:r>
+        <w:rPr>
+          <w:rFonts w:ascii="Times New Roman" w:hAnsi="Times New Roman"/>
+          <w:b/>
+          <w:color w:val="00629B"/>
+          <w:sz w:val="19"/>
+        </w:rPr>
+        <w:t xml:space="preserve">[6] </w:t>
+      </w:r>
+      <w:r>
+        <w:rPr>
+          <w:rFonts w:ascii="Times New Roman" w:hAnsi="Times New Roman"/>
+          <w:sz w:val="19"/>
+        </w:rPr>
+        <w:t xml:space="preserve">J. Lee, "Development of alternative filters to enhance the quality of digital images," ResearchGate / Digital Imaging Systems, 2024. </w:t>
+      </w:r>
+      <w:hyperlink r:id="rId16">
+        <w:r>
+          <w:t>https://www.researchgate.net/publication/379091587_Development_of_Alternative_Filters_to_Enhance_the_Quality_of_Digital_Images</w:t>
+          <w:rPr>
+            <w:rFonts w:ascii="Times New Roman" w:hAnsi="Times New Roman"/>
+            <w:sz w:val="19"/>
+            <w:color w:val="0066CC"/>
+            <w:u w:val="single"/>
+          </w:rPr>
+        </w:r>
+      </w:hyperlink>
+    </w:p>
+    <w:p>
+      <w:pPr>
+        <w:spacing w:after="60" w:line="264" w:lineRule="auto"/>
+        <w:jc w:val="both"/>
+      </w:pPr>
+      <w:r>
+        <w:rPr>
+          <w:rFonts w:ascii="Times New Roman" w:hAnsi="Times New Roman"/>
+          <w:b/>
+          <w:color w:val="00629B"/>
+          <w:sz w:val="19"/>
+        </w:rPr>
+        <w:t xml:space="preserve">[7] </w:t>
+      </w:r>
+      <w:r>
+        <w:rPr>
+          <w:rFonts w:ascii="Times New Roman" w:hAnsi="Times New Roman"/>
+          <w:sz w:val="19"/>
+        </w:rPr>
+        <w:t xml:space="preserve">R. S. Jebur, M. H. Bin Mohamed Zabil, D. A. Hammood, and L. K. Cheng, "A comprehensive review of image denoising in deep learning," Multimedia Tools Appl., vol. 83, pp. 45671–45712, 2023. </w:t>
+      </w:r>
+      <w:hyperlink r:id="rId17">
+        <w:r>
+          <w:t>https://link.springer.com/article/10.1007/s11042-023-17468-2</w:t>
+          <w:rPr>
+            <w:rFonts w:ascii="Times New Roman" w:hAnsi="Times New Roman"/>
+            <w:sz w:val="19"/>
+            <w:color w:val="0066CC"/>
+            <w:u w:val="single"/>
+          </w:rPr>
+        </w:r>
+      </w:hyperlink>
+    </w:p>
+    <w:p>
+      <w:pPr>
+        <w:spacing w:after="60" w:line="264" w:lineRule="auto"/>
+        <w:jc w:val="both"/>
+      </w:pPr>
+      <w:r>
+        <w:rPr>
+          <w:rFonts w:ascii="Times New Roman" w:hAnsi="Times New Roman"/>
+          <w:b/>
+          <w:color w:val="00629B"/>
+          <w:sz w:val="19"/>
+        </w:rPr>
+        <w:t xml:space="preserve">[8] </w:t>
+      </w:r>
+      <w:r>
+        <w:rPr>
+          <w:rFonts w:ascii="Times New Roman" w:hAnsi="Times New Roman"/>
+          <w:sz w:val="19"/>
+        </w:rPr>
+        <w:t xml:space="preserve">S. Mittal et al., "LIVENet: A novel network for real-world low-light image denoising and enhancement," in Proc. IEEE/CVF Winter Conf. Appl. Comput. Vis. (WACV), pp. 2960–2970, 2024. </w:t>
+      </w:r>
+      <w:hyperlink r:id="rId18">
+        <w:r>
+          <w:t>https://ieeexplore.ieee.org/document/10483686</w:t>
+          <w:rPr>
+            <w:rFonts w:ascii="Times New Roman" w:hAnsi="Times New Roman"/>
+            <w:sz w:val="19"/>
+            <w:color w:val="0066CC"/>
+            <w:u w:val="single"/>
+          </w:rPr>
+        </w:r>
+      </w:hyperlink>
+    </w:p>
+    <w:p>
+      <w:pPr>
+        <w:spacing w:after="60" w:line="264" w:lineRule="auto"/>
+        <w:jc w:val="both"/>
+      </w:pPr>
+      <w:r>
+        <w:rPr>
+          <w:rFonts w:ascii="Times New Roman" w:hAnsi="Times New Roman"/>
+          <w:b/>
+          <w:color w:val="00629B"/>
+          <w:sz w:val="19"/>
+        </w:rPr>
+        <w:t xml:space="preserve">[9] </w:t>
+      </w:r>
+      <w:r>
+        <w:rPr>
+          <w:rFonts w:ascii="Times New Roman" w:hAnsi="Times New Roman"/>
+          <w:sz w:val="19"/>
+        </w:rPr>
+        <w:t xml:space="preserve">Z. Zhou, Y. Chen, and Y. Zhou, "Deep dynamic memory augmented attentional dictionary learning for image denoising," IEEE Trans. Circuits Syst. Video Technol., vol. 33, no. 9, pp. 4668–4682, 2023. </w:t>
+      </w:r>
+      <w:hyperlink r:id="rId19">
+        <w:r>
+          <w:t>https://ieeexplore.ieee.org/abstract/document/10054440</w:t>
+          <w:rPr>
+            <w:rFonts w:ascii="Times New Roman" w:hAnsi="Times New Roman"/>
+            <w:sz w:val="19"/>
+            <w:color w:val="0066CC"/>
+            <w:u w:val="single"/>
+          </w:rPr>
+        </w:r>
+      </w:hyperlink>
+    </w:p>
+    <w:p>
+      <w:pPr>
+        <w:spacing w:after="60" w:line="264" w:lineRule="auto"/>
+        <w:jc w:val="both"/>
+      </w:pPr>
+      <w:r>
+        <w:rPr>
+          <w:rFonts w:ascii="Times New Roman" w:hAnsi="Times New Roman"/>
+          <w:b/>
+          <w:color w:val="00629B"/>
+          <w:sz w:val="19"/>
+        </w:rPr>
+        <w:t xml:space="preserve">[10] </w:t>
+      </w:r>
+      <w:r>
+        <w:rPr>
+          <w:rFonts w:ascii="Times New Roman" w:hAnsi="Times New Roman"/>
+          <w:sz w:val="19"/>
+        </w:rPr>
+        <w:t xml:space="preserve">O. Gupta, I. N. Kalapala, and K. M. Bhurchandi, "Enhancing image denoising performance through a family of algorithms," in Proc. IEEE ISCON, pp. 1–6, 2023. </w:t>
+      </w:r>
+      <w:hyperlink r:id="rId20">
+        <w:r>
+          <w:t>https://ieeexplore.ieee.org/abstract/document/10136117</w:t>
+          <w:rPr>
+            <w:rFonts w:ascii="Times New Roman" w:hAnsi="Times New Roman"/>
+            <w:sz w:val="19"/>
+            <w:color w:val="0066CC"/>
+            <w:u w:val="single"/>
+          </w:rPr>
+        </w:r>
+      </w:hyperlink>
+    </w:p>
+    <w:p>
+      <w:pPr>
+        <w:spacing w:after="60" w:line="264" w:lineRule="auto"/>
+        <w:jc w:val="both"/>
+      </w:pPr>
+      <w:r>
+        <w:rPr>
+          <w:rFonts w:ascii="Times New Roman" w:hAnsi="Times New Roman"/>
+          <w:b/>
+          <w:color w:val="00629B"/>
+          <w:sz w:val="19"/>
+        </w:rPr>
+        <w:t xml:space="preserve">[11] </w:t>
+      </w:r>
+      <w:r>
+        <w:rPr>
+          <w:rFonts w:ascii="Times New Roman" w:hAnsi="Times New Roman"/>
+          <w:sz w:val="19"/>
+        </w:rPr>
+        <w:t xml:space="preserve">L. Zhou, D. Zhou, H. Yang, S. Yang, and L. Nie, "Multi-scale network toward real-world image denoising," Int. J. Mach. Learn. Cybern., vol. 14, pp. 1109–1123, 2023. </w:t>
+      </w:r>
+      <w:hyperlink r:id="rId21">
+        <w:r>
+          <w:t>https://link.springer.com/article/10.1007/s13042-022-01694-5</w:t>
+          <w:rPr>
+            <w:rFonts w:ascii="Times New Roman" w:hAnsi="Times New Roman"/>
+            <w:sz w:val="19"/>
+            <w:color w:val="0066CC"/>
+            <w:u w:val="single"/>
+          </w:rPr>
+        </w:r>
+      </w:hyperlink>
+    </w:p>
+    <w:p>
+      <w:pPr>
+        <w:spacing w:after="60" w:line="264" w:lineRule="auto"/>
+        <w:jc w:val="both"/>
+      </w:pPr>
+      <w:r>
+        <w:rPr>
+          <w:rFonts w:ascii="Times New Roman" w:hAnsi="Times New Roman"/>
+          <w:b/>
+          <w:color w:val="00629B"/>
+          <w:sz w:val="19"/>
+        </w:rPr>
+        <w:t xml:space="preserve">[12] </w:t>
+      </w:r>
+      <w:r>
+        <w:rPr>
+          <w:rFonts w:ascii="Times New Roman" w:hAnsi="Times New Roman"/>
+          <w:sz w:val="19"/>
+        </w:rPr>
+        <w:t xml:space="preserve">A. Ulu, G. Yildiz, and B. Dizdaroğlu, "MLFAN: Multilevel feature attention network with texture prior for image denoising," IEEE Access, vol. 11, pp. 35647–35661, 2023. </w:t>
+      </w:r>
+      <w:hyperlink r:id="rId22">
+        <w:r>
+          <w:t>https://ieeexplore.ieee.org/abstract/document/10092851</w:t>
+          <w:rPr>
+            <w:rFonts w:ascii="Times New Roman" w:hAnsi="Times New Roman"/>
+            <w:sz w:val="19"/>
+            <w:color w:val="0066CC"/>
+            <w:u w:val="single"/>
+          </w:rPr>
+        </w:r>
+      </w:hyperlink>
+    </w:p>
+    <w:p>
+      <w:pPr>
+        <w:spacing w:after="60" w:line="264" w:lineRule="auto"/>
+        <w:jc w:val="both"/>
+      </w:pPr>
+      <w:r>
+        <w:rPr>
+          <w:rFonts w:ascii="Times New Roman" w:hAnsi="Times New Roman"/>
+          <w:b/>
+          <w:color w:val="00629B"/>
+          <w:sz w:val="19"/>
+        </w:rPr>
+        <w:t xml:space="preserve">[13] </w:t>
+      </w:r>
+      <w:r>
+        <w:rPr>
+          <w:rFonts w:ascii="Times New Roman" w:hAnsi="Times New Roman"/>
+          <w:sz w:val="19"/>
+        </w:rPr>
+        <w:t xml:space="preserve">G. Zhang, G. Zhang, Q. Lu, Y. Bo, and X. Zhou, "Application of improved Canny algorithm in image edge detection of transmission lines," in Proc. IEEE ICICML, pp. 312–316, 2024. </w:t>
+      </w:r>
+      <w:hyperlink r:id="rId23">
+        <w:r>
+          <w:t>https://ieeexplore.ieee.org/abstract/document/10424911</w:t>
+          <w:rPr>
+            <w:rFonts w:ascii="Times New Roman" w:hAnsi="Times New Roman"/>
+            <w:sz w:val="19"/>
+            <w:color w:val="0066CC"/>
+            <w:u w:val="single"/>
+          </w:rPr>
+        </w:r>
+      </w:hyperlink>
+    </w:p>
+    <w:p>
+      <w:pPr>
+        <w:spacing w:after="60" w:line="264" w:lineRule="auto"/>
+        <w:jc w:val="both"/>
+      </w:pPr>
+      <w:r>
+        <w:rPr>
+          <w:rFonts w:ascii="Times New Roman" w:hAnsi="Times New Roman"/>
+          <w:b/>
+          <w:color w:val="00629B"/>
+          <w:sz w:val="19"/>
+        </w:rPr>
+        <w:t xml:space="preserve">[14] </w:t>
+      </w:r>
+      <w:r>
+        <w:rPr>
+          <w:rFonts w:ascii="Times New Roman" w:hAnsi="Times New Roman"/>
+          <w:sz w:val="19"/>
+        </w:rPr>
+        <w:t xml:space="preserve">A. Ranganath, F. Santiago, O. DeGuchy, M. Singhal, and R. F. Marcia, "Recurrent neural imaging: An evolutionary approach for mixed Poisson-Gaussian image denoising," in Proc. IEEE DISCOVERY, pp. 1–6, 2023. </w:t>
+      </w:r>
+      <w:hyperlink r:id="rId24">
+        <w:r>
+          <w:t>https://ieeexplore.ieee.org/abstract/document/10069162/</w:t>
+          <w:rPr>
+            <w:rFonts w:ascii="Times New Roman" w:hAnsi="Times New Roman"/>
+            <w:sz w:val="19"/>
+            <w:color w:val="0066CC"/>
+            <w:u w:val="single"/>
+          </w:rPr>
+        </w:r>
+      </w:hyperlink>
+    </w:p>
+    <w:p>
+      <w:pPr>
+        <w:spacing w:after="60" w:line="264" w:lineRule="auto"/>
+        <w:jc w:val="both"/>
+      </w:pPr>
+      <w:r>
+        <w:rPr>
+          <w:rFonts w:ascii="Times New Roman" w:hAnsi="Times New Roman"/>
+          <w:b/>
+          <w:color w:val="00629B"/>
+          <w:sz w:val="19"/>
+        </w:rPr>
+        <w:t xml:space="preserve">[15] </w:t>
+      </w:r>
+      <w:r>
+        <w:rPr>
+          <w:rFonts w:ascii="Times New Roman" w:hAnsi="Times New Roman"/>
+          <w:sz w:val="19"/>
+        </w:rPr>
+        <w:t xml:space="preserve">T. Direk, "Image denoising by linear regression on non-local means algorithm," Signal, Image Video Process., vol. 18, pp. 3185–3194, 2024. </w:t>
+      </w:r>
+      <w:hyperlink r:id="rId25">
+        <w:r>
+          <w:t>https://link.springer.com/article/10.1007/s11760-024-03086-4</w:t>
+          <w:rPr>
+            <w:rFonts w:ascii="Times New Roman" w:hAnsi="Times New Roman"/>
+            <w:sz w:val="19"/>
+            <w:color w:val="0066CC"/>
+            <w:u w:val="single"/>
+          </w:rPr>
+        </w:r>
+      </w:hyperlink>
+    </w:p>
+    <w:p>
+      <w:pPr>
+        <w:spacing w:after="60" w:line="264" w:lineRule="auto"/>
+        <w:jc w:val="both"/>
+      </w:pPr>
+      <w:r>
+        <w:rPr>
+          <w:rFonts w:ascii="Times New Roman" w:hAnsi="Times New Roman"/>
+          <w:b/>
+          <w:color w:val="00629B"/>
+          <w:sz w:val="19"/>
+        </w:rPr>
+        <w:t xml:space="preserve">[16] </w:t>
+      </w:r>
+      <w:r>
+        <w:rPr>
+          <w:rFonts w:ascii="Times New Roman" w:hAnsi="Times New Roman"/>
+          <w:sz w:val="19"/>
+        </w:rPr>
+        <w:t xml:space="preserve">M. Delbracio, D. Kelly, M. S. Brown, and P. Milanfar, "Mobile computational photography: A tour," Annu. Rev. Vis. Sci., vol. 7, pp. 571–604, 2021. </w:t>
+      </w:r>
+      <w:hyperlink r:id="rId26">
+        <w:r>
+          <w:t>https://doi.org/10.1146/annurev-vision-093020-112830</w:t>
+          <w:rPr>
+            <w:rFonts w:ascii="Times New Roman" w:hAnsi="Times New Roman"/>
+            <w:sz w:val="19"/>
+            <w:color w:val="0066CC"/>
+            <w:u w:val="single"/>
+          </w:rPr>
+        </w:r>
+      </w:hyperlink>
+    </w:p>
+    <w:p>
+      <w:pPr>
+        <w:spacing w:after="60" w:line="264" w:lineRule="auto"/>
+        <w:jc w:val="both"/>
+      </w:pPr>
+      <w:r>
+        <w:rPr>
+          <w:rFonts w:ascii="Times New Roman" w:hAnsi="Times New Roman"/>
+          <w:b/>
+          <w:color w:val="00629B"/>
+          <w:sz w:val="19"/>
+        </w:rPr>
+        <w:t xml:space="preserve">[17] </w:t>
+      </w:r>
+      <w:r>
+        <w:rPr>
+          <w:rFonts w:ascii="Times New Roman" w:hAnsi="Times New Roman"/>
+          <w:sz w:val="19"/>
+        </w:rPr>
+        <w:t xml:space="preserve">K. Zhang, W. Zuo, Y. Chen, D. Meng, and L. Zhang, "Beyond a Gaussian denoiser: Residual learning of deep CNN for image denoising," IEEE Trans. Image Process., vol. 26, no. 7, pp. 3142–3155, 2017. </w:t>
+      </w:r>
+      <w:hyperlink r:id="rId27">
+        <w:r>
+          <w:t>https://doi.org/10.1109/TIP.2017.2662206</w:t>
+          <w:rPr>
+            <w:rFonts w:ascii="Times New Roman" w:hAnsi="Times New Roman"/>
+            <w:sz w:val="19"/>
+            <w:color w:val="0066CC"/>
+            <w:u w:val="single"/>
+          </w:rPr>
+        </w:r>
+      </w:hyperlink>
+    </w:p>
+    <w:p>
+      <w:pPr>
+        <w:spacing w:after="60" w:line="264" w:lineRule="auto"/>
+        <w:jc w:val="both"/>
+      </w:pPr>
+      <w:r>
+        <w:rPr>
+          <w:rFonts w:ascii="Times New Roman" w:hAnsi="Times New Roman"/>
+          <w:b/>
+          <w:color w:val="00629B"/>
+          <w:sz w:val="19"/>
+        </w:rPr>
+        <w:t xml:space="preserve">[18] </w:t>
+      </w:r>
+      <w:r>
+        <w:rPr>
+          <w:rFonts w:ascii="Times New Roman" w:hAnsi="Times New Roman"/>
+          <w:sz w:val="19"/>
+        </w:rPr>
+        <w:t xml:space="preserve">O. Ronneberger, P. Fischer, and T. Brox, "U-Net: Convolutional networks for biomedical image segmentation," in Proc. MICCAI, LNCS, vol. 9351, pp. 234–241, 2015. </w:t>
+      </w:r>
+      <w:hyperlink r:id="rId28">
+        <w:r>
+          <w:t>https://doi.org/10.1007/978-3-319-24574-4_28</w:t>
+          <w:rPr>
+            <w:rFonts w:ascii="Times New Roman" w:hAnsi="Times New Roman"/>
+            <w:sz w:val="19"/>
+            <w:color w:val="0066CC"/>
+            <w:u w:val="single"/>
+          </w:rPr>
+        </w:r>
+      </w:hyperlink>
+    </w:p>
+    <w:p>
+      <w:pPr>
+        <w:spacing w:after="60" w:line="264" w:lineRule="auto"/>
+        <w:jc w:val="both"/>
+      </w:pPr>
+      <w:r>
+        <w:rPr>
+          <w:rFonts w:ascii="Times New Roman" w:hAnsi="Times New Roman"/>
+          <w:b/>
+          <w:color w:val="00629B"/>
+          <w:sz w:val="19"/>
+        </w:rPr>
+        <w:t xml:space="preserve">[19] </w:t>
+      </w:r>
+      <w:r>
+        <w:rPr>
+          <w:rFonts w:ascii="Times New Roman" w:hAnsi="Times New Roman"/>
+          <w:sz w:val="19"/>
+        </w:rPr>
+        <w:t xml:space="preserve">A. Foi, M. Trimeche, V. Katkovnik, and K. Egiazarian, "Practical Poissonian-Gaussian noise modeling and fitting for single-image raw-data," IEEE Trans. Image Process., vol. 17, no. 10, pp. 1737–1754, 2008. </w:t>
+      </w:r>
+      <w:hyperlink r:id="rId29">
+        <w:r>
+          <w:t>https://doi.org/10.1109/TIP.2008.2001399</w:t>
+          <w:rPr>
+            <w:rFonts w:ascii="Times New Roman" w:hAnsi="Times New Roman"/>
+            <w:sz w:val="19"/>
+            <w:color w:val="0066CC"/>
+            <w:u w:val="single"/>
+          </w:rPr>
+        </w:r>
+      </w:hyperlink>
+    </w:p>
+    <w:p>
+      <w:pPr>
+        <w:spacing w:after="60" w:line="264" w:lineRule="auto"/>
+        <w:jc w:val="both"/>
+      </w:pPr>
+      <w:r>
+        <w:rPr>
+          <w:rFonts w:ascii="Times New Roman" w:hAnsi="Times New Roman"/>
+          <w:b/>
+          <w:color w:val="00629B"/>
+          <w:sz w:val="19"/>
+        </w:rPr>
+        <w:t xml:space="preserve">[20] </w:t>
+      </w:r>
+      <w:r>
+        <w:rPr>
+          <w:rFonts w:ascii="Times New Roman" w:hAnsi="Times New Roman"/>
+          <w:sz w:val="19"/>
+        </w:rPr>
+        <w:t xml:space="preserve">A. Abdelhamed, S. Lin, and M. S. Brown, "A high-quality smartphone dataset for image denoising," in Proc. IEEE Conf. Comput. Vis. Pattern Recognit. (CVPR), pp. 1692–1700, 2018. </w:t>
+      </w:r>
+      <w:hyperlink r:id="rId30">
+        <w:r>
+          <w:t>https://doi.org/10.1109/CVPR.2018.00182</w:t>
+          <w:rPr>
+            <w:rFonts w:ascii="Times New Roman" w:hAnsi="Times New Roman"/>
+            <w:sz w:val="19"/>
+            <w:color w:val="0066CC"/>
+            <w:u w:val="single"/>
+          </w:rPr>
+        </w:r>
+      </w:hyperlink>
+    </w:p>
+    <w:p>
+      <w:pPr>
+        <w:spacing w:after="60" w:line="264" w:lineRule="auto"/>
+        <w:jc w:val="both"/>
+      </w:pPr>
+      <w:r>
+        <w:rPr>
+          <w:rFonts w:ascii="Times New Roman" w:hAnsi="Times New Roman"/>
+          <w:b/>
+          <w:color w:val="00629B"/>
+          <w:sz w:val="19"/>
+        </w:rPr>
+        <w:t xml:space="preserve">[21] </w:t>
+      </w:r>
+      <w:r>
+        <w:rPr>
+          <w:rFonts w:ascii="Times New Roman" w:hAnsi="Times New Roman"/>
+          <w:sz w:val="19"/>
+        </w:rPr>
+        <w:t xml:space="preserve">Y. Huang et al., "Evaluation of tiling strategies for deep learning image restoration on ultra-high-resolution images," IEEE Access, vol. 9, pp. 84120–84131, 2021. </w:t>
+      </w:r>
+      <w:hyperlink r:id="rId31">
+        <w:r>
+          <w:t>https://doi.org/10.1109/ACCESS.2021.3087265</w:t>
+          <w:rPr>
+            <w:rFonts w:ascii="Times New Roman" w:hAnsi="Times New Roman"/>
+            <w:sz w:val="19"/>
+            <w:color w:val="0066CC"/>
+            <w:u w:val="single"/>
+          </w:rPr>
+        </w:r>
+      </w:hyperlink>
+    </w:p>
+    <w:p>
+      <w:pPr>
+        <w:spacing w:after="60" w:line="264" w:lineRule="auto"/>
+        <w:jc w:val="both"/>
+      </w:pPr>
+      <w:r>
+        <w:rPr>
+          <w:rFonts w:ascii="Times New Roman" w:hAnsi="Times New Roman"/>
+          <w:b/>
+          <w:color w:val="00629B"/>
+          <w:sz w:val="19"/>
+        </w:rPr>
+        <w:t xml:space="preserve">[22] </w:t>
+      </w:r>
+      <w:r>
+        <w:rPr>
+          <w:rFonts w:ascii="Times New Roman" w:hAnsi="Times New Roman"/>
+          <w:sz w:val="19"/>
+        </w:rPr>
+        <w:t xml:space="preserve">J. Immerkaer, "Fast noise variance estimation," Comput. Vis. Image Underst., vol. 64, no. 2, pp. 300–302, 1996. </w:t>
+      </w:r>
+      <w:hyperlink r:id="rId32">
+        <w:r>
+          <w:t>https://doi.org/10.1006/cviu.1996.0060</w:t>
+          <w:rPr>
+            <w:rFonts w:ascii="Times New Roman" w:hAnsi="Times New Roman"/>
+            <w:sz w:val="19"/>
+            <w:color w:val="0066CC"/>
+            <w:u w:val="single"/>
+          </w:rPr>
+        </w:r>
+      </w:hyperlink>
+    </w:p>
+    <w:p>
+      <w:pPr>
+        <w:keepNext/>
+        <w:spacing w:before="280" w:after="80"/>
+      </w:pPr>
+      <w:r>
+        <w:rPr>
+          <w:rFonts w:ascii="Arial" w:hAnsi="Arial"/>
+          <w:b/>
+          <w:color w:val="00629B"/>
+          <w:sz w:val="23"/>
+        </w:rPr>
         <w:t>AUTHOR BIOGRAPHIES</w:t>
       </w:r>
     </w:p>

</xml_diff>